<commit_message>
Section 2 is done
</commit_message>
<xml_diff>
--- a/abstract.docx
+++ b/abstract.docx
@@ -98,7 +98,93 @@
         <w:rPr>
           <w:lang w:val="en-US"/>
         </w:rPr>
-        <w:t>enable the deterministic tracing</w:t>
+        <w:t xml:space="preserve">enable the deterministic tracing </w:t>
+      </w:r>
+      <w:r>
+        <w:rPr>
+          <w:lang w:val="en-US"/>
+        </w:rPr>
+        <w:t xml:space="preserve">of </w:t>
+      </w:r>
+      <w:r>
+        <w:rPr>
+          <w:lang w:val="en-US"/>
+        </w:rPr>
+        <w:t>analytical and ML results back to their raw sources.</w:t>
+      </w:r>
+      <w:r>
+        <w:rPr>
+          <w:lang w:val="en-US"/>
+        </w:rPr>
+        <w:t xml:space="preserve"> T</w:t>
+      </w:r>
+      <w:r>
+        <w:rPr>
+          <w:lang w:val="en-US"/>
+        </w:rPr>
+        <w:t>his provides a formal</w:t>
+      </w:r>
+      <w:r>
+        <w:rPr>
+          <w:lang w:val="en-US"/>
+        </w:rPr>
+        <w:t xml:space="preserve"> and</w:t>
+      </w:r>
+      <w:r>
+        <w:rPr>
+          <w:lang w:val="en-US"/>
+        </w:rPr>
+        <w:t xml:space="preserve"> transparent baseline for debugging and explaining data-driven outcomes.</w:t>
+      </w:r>
+    </w:p>
+    <w:p>
+      <w:pPr>
+        <w:rPr>
+          <w:lang w:val="en-US"/>
+        </w:rPr>
+      </w:pPr>
+    </w:p>
+    <w:p>
+      <w:pPr>
+        <w:rPr>
+          <w:lang w:val="en-US"/>
+        </w:rPr>
+      </w:pPr>
+      <w:r>
+        <w:rPr>
+          <w:lang w:val="en-US"/>
+        </w:rPr>
+        <w:t xml:space="preserve">Building on these foundations, we present two </w:t>
+      </w:r>
+      <w:r>
+        <w:rPr>
+          <w:lang w:val="en-US"/>
+        </w:rPr>
+        <w:t xml:space="preserve">representative </w:t>
+      </w:r>
+      <w:r>
+        <w:rPr>
+          <w:lang w:val="en-US"/>
+        </w:rPr>
+        <w:t>examples</w:t>
+      </w:r>
+      <w:r>
+        <w:rPr>
+          <w:lang w:val="en-US"/>
+        </w:rPr>
+        <w:t xml:space="preserve">. </w:t>
+      </w:r>
+      <w:r>
+        <w:rPr>
+          <w:lang w:val="en-US"/>
+        </w:rPr>
+        <w:t xml:space="preserve">The first presents a baseline data lineage scenario, illustrating how individual output tuples produced </w:t>
+      </w:r>
+      <w:r>
+        <w:rPr>
+          <w:lang w:val="en-US"/>
+        </w:rPr>
+        <w:t>through</w:t>
       </w:r>
       <w:r>
         <w:rPr>
@@ -110,87 +196,55 @@
         <w:rPr>
           <w:lang w:val="en-US"/>
         </w:rPr>
-        <w:t xml:space="preserve">of </w:t>
-      </w:r>
-      <w:r>
-        <w:rPr>
-          <w:lang w:val="en-US"/>
-        </w:rPr>
-        <w:t>analytical and ML results back to their raw sources.</w:t>
-      </w:r>
-      <w:r>
-        <w:rPr>
-          <w:lang w:val="en-US"/>
-        </w:rPr>
-        <w:t xml:space="preserve"> T</w:t>
-      </w:r>
-      <w:r>
-        <w:rPr>
-          <w:lang w:val="en-US"/>
-        </w:rPr>
-        <w:t>his provides a formal</w:t>
-      </w:r>
-      <w:r>
-        <w:rPr>
-          <w:lang w:val="en-US"/>
-        </w:rPr>
-        <w:t xml:space="preserve"> and</w:t>
-      </w:r>
-      <w:r>
-        <w:rPr>
-          <w:lang w:val="en-US"/>
-        </w:rPr>
-        <w:t xml:space="preserve"> transparent baseline for debugging and explaining data-driven outcomes.</w:t>
-      </w:r>
-    </w:p>
-    <w:p>
-      <w:pPr>
-        <w:rPr>
-          <w:lang w:val="en-US"/>
-        </w:rPr>
-      </w:pPr>
-    </w:p>
-    <w:p>
-      <w:pPr>
-        <w:rPr>
-          <w:lang w:val="en-US"/>
-        </w:rPr>
-      </w:pPr>
-      <w:r>
-        <w:rPr>
-          <w:lang w:val="en-US"/>
-        </w:rPr>
-        <w:t xml:space="preserve">Building on these foundations, we present two </w:t>
-      </w:r>
-      <w:r>
-        <w:rPr>
-          <w:lang w:val="en-US"/>
-        </w:rPr>
-        <w:t xml:space="preserve">representative </w:t>
-      </w:r>
-      <w:r>
-        <w:rPr>
-          <w:lang w:val="en-US"/>
-        </w:rPr>
-        <w:t>examples</w:t>
-      </w:r>
-      <w:r>
-        <w:rPr>
-          <w:lang w:val="en-US"/>
-        </w:rPr>
-        <w:t xml:space="preserve">. </w:t>
-      </w:r>
-      <w:r>
-        <w:rPr>
-          <w:lang w:val="en-US"/>
-        </w:rPr>
-        <w:t xml:space="preserve">The first presents a baseline data lineage scenario, illustrating how individual output tuples produced </w:t>
-      </w:r>
-      <w:r>
-        <w:rPr>
-          <w:lang w:val="en-US"/>
-        </w:rPr>
-        <w:t>through</w:t>
+        <w:t xml:space="preserve">common operations such as selection, </w:t>
+      </w:r>
+      <w:r>
+        <w:rPr>
+          <w:lang w:val="en-US"/>
+        </w:rPr>
+        <w:t xml:space="preserve">projection, </w:t>
+      </w:r>
+      <w:r>
+        <w:rPr>
+          <w:lang w:val="en-US"/>
+        </w:rPr>
+        <w:t>join</w:t>
+      </w:r>
+      <w:r>
+        <w:rPr>
+          <w:lang w:val="en-US"/>
+        </w:rPr>
+        <w:t xml:space="preserve">, </w:t>
+      </w:r>
+      <w:r>
+        <w:rPr>
+          <w:lang w:val="en-US"/>
+        </w:rPr>
+        <w:t xml:space="preserve">union </w:t>
+      </w:r>
+      <w:r>
+        <w:rPr>
+          <w:lang w:val="en-US"/>
+        </w:rPr>
+        <w:t xml:space="preserve">and </w:t>
+      </w:r>
+      <w:r>
+        <w:rPr>
+          <w:lang w:val="en-US"/>
+        </w:rPr>
+        <w:t xml:space="preserve">aggregation, can be traced back to the source </w:t>
+      </w:r>
+      <w:r>
+        <w:rPr>
+          <w:lang w:val="en-US"/>
+        </w:rPr>
+        <w:t>data</w:t>
+      </w:r>
+      <w:r>
+        <w:rPr>
+          <w:lang w:val="en-US"/>
+        </w:rPr>
+        <w:t xml:space="preserve"> that contributed to their derivation.</w:t>
       </w:r>
       <w:r>
         <w:rPr>
@@ -202,55 +256,7 @@
         <w:rPr>
           <w:lang w:val="en-US"/>
         </w:rPr>
-        <w:t xml:space="preserve">common operations such as selection, </w:t>
-      </w:r>
-      <w:r>
-        <w:rPr>
-          <w:lang w:val="en-US"/>
-        </w:rPr>
-        <w:t xml:space="preserve">projection, </w:t>
-      </w:r>
-      <w:r>
-        <w:rPr>
-          <w:lang w:val="en-US"/>
-        </w:rPr>
-        <w:t>join</w:t>
-      </w:r>
-      <w:r>
-        <w:rPr>
-          <w:lang w:val="en-US"/>
-        </w:rPr>
-        <w:t xml:space="preserve">, </w:t>
-      </w:r>
-      <w:r>
-        <w:rPr>
-          <w:lang w:val="en-US"/>
-        </w:rPr>
-        <w:t xml:space="preserve">union </w:t>
-      </w:r>
-      <w:r>
-        <w:rPr>
-          <w:lang w:val="en-US"/>
-        </w:rPr>
-        <w:t xml:space="preserve">and </w:t>
-      </w:r>
-      <w:r>
-        <w:rPr>
-          <w:lang w:val="en-US"/>
-        </w:rPr>
-        <w:t xml:space="preserve">aggregation, can be traced back to the source </w:t>
-      </w:r>
-      <w:r>
-        <w:rPr>
-          <w:lang w:val="en-US"/>
-        </w:rPr>
-        <w:t>data</w:t>
-      </w:r>
-      <w:r>
-        <w:rPr>
-          <w:lang w:val="en-US"/>
-        </w:rPr>
-        <w:t xml:space="preserve"> that contributed to their derivation.</w:t>
+        <w:t>The second case introduces a</w:t>
       </w:r>
       <w:r>
         <w:rPr>
@@ -262,7 +268,13 @@
         <w:rPr>
           <w:lang w:val="en-US"/>
         </w:rPr>
-        <w:t>The second case introduces a</w:t>
+        <w:t xml:space="preserve">root-cause analysis for an employee promotion prediction model. </w:t>
+      </w:r>
+      <w:r>
+        <w:rPr>
+          <w:lang w:val="en-US"/>
+        </w:rPr>
+        <w:t>It</w:t>
       </w:r>
       <w:r>
         <w:rPr>
@@ -274,13 +286,31 @@
         <w:rPr>
           <w:lang w:val="en-US"/>
         </w:rPr>
-        <w:t xml:space="preserve">root-cause analysis for an employee promotion prediction model. </w:t>
-      </w:r>
-      <w:r>
-        <w:rPr>
-          <w:lang w:val="en-US"/>
-        </w:rPr>
-        <w:t>It</w:t>
+        <w:t>puts in evidence</w:t>
+      </w:r>
+      <w:r>
+        <w:rPr>
+          <w:lang w:val="en-US"/>
+        </w:rPr>
+        <w:t xml:space="preserve"> how </w:t>
+      </w:r>
+      <w:r>
+        <w:rPr>
+          <w:lang w:val="en-US"/>
+        </w:rPr>
+        <w:t>intermediate data</w:t>
+      </w:r>
+      <w:r>
+        <w:rPr>
+          <w:lang w:val="en-US"/>
+        </w:rPr>
+        <w:t xml:space="preserve"> outside the training </w:t>
+      </w:r>
+      <w:r>
+        <w:rPr>
+          <w:lang w:val="en-US"/>
+        </w:rPr>
+        <w:t>dataset</w:t>
       </w:r>
       <w:r>
         <w:rPr>
@@ -292,42 +322,6 @@
         <w:rPr>
           <w:lang w:val="en-US"/>
         </w:rPr>
-        <w:t>puts in evidence</w:t>
-      </w:r>
-      <w:r>
-        <w:rPr>
-          <w:lang w:val="en-US"/>
-        </w:rPr>
-        <w:t xml:space="preserve"> how </w:t>
-      </w:r>
-      <w:r>
-        <w:rPr>
-          <w:lang w:val="en-US"/>
-        </w:rPr>
-        <w:t>intermediate data</w:t>
-      </w:r>
-      <w:r>
-        <w:rPr>
-          <w:lang w:val="en-US"/>
-        </w:rPr>
-        <w:t xml:space="preserve"> outside the training </w:t>
-      </w:r>
-      <w:r>
-        <w:rPr>
-          <w:lang w:val="en-US"/>
-        </w:rPr>
-        <w:t>dataset</w:t>
-      </w:r>
-      <w:r>
-        <w:rPr>
-          <w:lang w:val="en-US"/>
-        </w:rPr>
-        <w:t xml:space="preserve"> </w:t>
-      </w:r>
-      <w:r>
-        <w:rPr>
-          <w:lang w:val="en-US"/>
-        </w:rPr>
         <w:t xml:space="preserve">can quietly condition model results, and how provenance polynomials allow to trace the underlying pathways through diverse perspectives, </w:t>
       </w:r>
       <w:r>
@@ -352,13 +346,7 @@
         <w:rPr>
           <w:lang w:val="en-US"/>
         </w:rPr>
-        <w:t xml:space="preserve"> </w:t>
-      </w:r>
-      <w:r>
-        <w:rPr>
-          <w:lang w:val="en-US"/>
-        </w:rPr>
-        <w:t xml:space="preserve">This </w:t>
+        <w:t xml:space="preserve"> This </w:t>
       </w:r>
       <w:r>
         <w:rPr>
@@ -939,7 +927,290 @@
         <w:t>&lt;/p&gt;</w:t>
       </w:r>
     </w:p>
-    <w:p/>
+    <w:p>
+      <w:r>
+        <w:br w:type="page"/>
+      </w:r>
+    </w:p>
+    <w:p>
+      <w:pPr>
+        <w:rPr>
+          <w:lang w:val="en-US"/>
+        </w:rPr>
+      </w:pPr>
+      <w:r>
+        <w:rPr>
+          <w:lang w:val="en-US"/>
+        </w:rPr>
+        <w:lastRenderedPageBreak/>
+        <w:t xml:space="preserve">Taking DataProv as a structural reference, the system </w:t>
+      </w:r>
+      <w:r>
+        <w:rPr>
+          <w:lang w:val="en-US"/>
+        </w:rPr>
+        <w:t>takes</w:t>
+      </w:r>
+      <w:r>
+        <w:rPr>
+          <w:lang w:val="en-US"/>
+        </w:rPr>
+        <w:t xml:space="preserve"> a declarative query </w:t>
+      </w:r>
+      <w:r>
+        <w:rPr>
+          <w:lang w:val="en-US"/>
+        </w:rPr>
+        <w:t>statement</w:t>
+      </w:r>
+      <w:r>
+        <w:rPr>
+          <w:lang w:val="en-US"/>
+        </w:rPr>
+        <w:t xml:space="preserve"> and</w:t>
+      </w:r>
+      <w:r>
+        <w:rPr>
+          <w:lang w:val="en-US"/>
+        </w:rPr>
+        <w:t xml:space="preserve"> builds</w:t>
+      </w:r>
+      <w:r>
+        <w:rPr>
+          <w:lang w:val="en-US"/>
+        </w:rPr>
+        <w:t xml:space="preserve"> an</w:t>
+      </w:r>
+      <w:r>
+        <w:rPr>
+          <w:lang w:val="en-US"/>
+        </w:rPr>
+        <w:t xml:space="preserve"> </w:t>
+      </w:r>
+      <w:r>
+        <w:rPr>
+          <w:lang w:val="en-US"/>
+        </w:rPr>
+        <w:t xml:space="preserve">Abstract Syntax Tree (AST) </w:t>
+      </w:r>
+      <w:r>
+        <w:rPr>
+          <w:lang w:val="en-US"/>
+        </w:rPr>
+        <w:t xml:space="preserve">representing the </w:t>
+      </w:r>
+      <w:r>
+        <w:rPr>
+          <w:lang w:val="en-US"/>
+        </w:rPr>
+        <w:t xml:space="preserve">logical structure of the query. </w:t>
+      </w:r>
+      <w:r>
+        <w:rPr>
+          <w:lang w:val="en-US"/>
+        </w:rPr>
+        <w:t>The nodes represent the operations</w:t>
+      </w:r>
+      <w:r>
+        <w:rPr>
+          <w:lang w:val="en-US"/>
+        </w:rPr>
+        <w:t>, namely, selection, projection, join, union and aggregation</w:t>
+      </w:r>
+      <w:r>
+        <w:rPr>
+          <w:lang w:val="en-US"/>
+        </w:rPr>
+        <w:t xml:space="preserve">, and the lines represent data </w:t>
+      </w:r>
+      <w:r>
+        <w:rPr>
+          <w:lang w:val="en-US"/>
+        </w:rPr>
+        <w:t>flows.</w:t>
+      </w:r>
+      <w:r>
+        <w:rPr>
+          <w:lang w:val="en-US"/>
+        </w:rPr>
+        <w:t xml:space="preserve"> </w:t>
+      </w:r>
+      <w:r>
+        <w:rPr>
+          <w:lang w:val="en-US"/>
+        </w:rPr>
+        <w:t xml:space="preserve">The nodes at the bottom are the data sources. </w:t>
+      </w:r>
+      <w:r>
+        <w:rPr>
+          <w:lang w:val="en-US"/>
+        </w:rPr>
+        <w:t>T</w:t>
+      </w:r>
+      <w:r>
+        <w:rPr>
+          <w:lang w:val="en-US"/>
+        </w:rPr>
+        <w:t xml:space="preserve">he AST are traversed </w:t>
+      </w:r>
+      <w:r>
+        <w:rPr>
+          <w:lang w:val="en-US"/>
+        </w:rPr>
+        <w:t xml:space="preserve">bottom-up and </w:t>
+      </w:r>
+      <w:r>
+        <w:rPr>
+          <w:lang w:val="en-US"/>
+        </w:rPr>
+        <w:t xml:space="preserve">the annotator maps </w:t>
+      </w:r>
+      <w:r>
+        <w:rPr>
+          <w:lang w:val="en-US"/>
+        </w:rPr>
+        <w:t>projections and selections to semiring multiplications, union combinations to semiring additions, and aggregate processing workflows to tensor scale modifications. Once these algebraic polynomial variables are injected directly into the corresponding AST expression nodes, the compiler performs an inverse translation rewrite to reconstruct a fully valid, synthesized target SQL statement</w:t>
+      </w:r>
+      <w:r>
+        <w:rPr>
+          <w:lang w:val="en-US"/>
+        </w:rPr>
+        <w:t>.</w:t>
+      </w:r>
+    </w:p>
+    <w:p>
+      <w:r>
+        <w:t>Resultado de uma</w:t>
+      </w:r>
+      <w:r>
+        <w:t xml:space="preserve"> consulta pode ser gravado com proveniência</w:t>
+      </w:r>
+      <w:r>
+        <w:t xml:space="preserve"> numa base de dados ou como uma dataset</w:t>
+      </w:r>
+      <w:r>
+        <w:t xml:space="preserve"> e usado recursivamente.</w:t>
+      </w:r>
+    </w:p>
+    <w:p>
+      <w:pPr>
+        <w:rPr>
+          <w:lang w:val="en-US"/>
+        </w:rPr>
+      </w:pPr>
+      <w:r>
+        <w:t xml:space="preserve">of </w:t>
+      </w:r>
+      <w:r>
+        <w:t xml:space="preserve">relational algebra execution plan. </w:t>
+      </w:r>
+      <w:r>
+        <w:rPr>
+          <w:lang w:val="en-US"/>
+        </w:rPr>
+        <w:t>In accordance with the foundational theories of provenance semirings and semi-modules, the engine systematically translates these database operators into mathematical structures, mapping projections and selections to semiring multiplications, union combinations to semiring additions, and aggregate processing workflows to tensor scale modifications. Once these algebraic polynomial variables are injected directly into the corresponding AST expression nodes, the compiler performs an inverse translation rewrite to reconstruct a fully valid, synthesized target SQL statement equipped with active execution provenance instrumentation layers.</w:t>
+      </w:r>
+    </w:p>
+    <w:p>
+      <w:pPr>
+        <w:rPr>
+          <w:lang w:val="en-US"/>
+        </w:rPr>
+      </w:pPr>
+    </w:p>
+    <w:p>
+      <w:pPr>
+        <w:rPr>
+          <w:lang w:val="en-US"/>
+        </w:rPr>
+      </w:pPr>
+    </w:p>
+    <w:p>
+      <w:pPr>
+        <w:rPr>
+          <w:lang w:val="en-US"/>
+        </w:rPr>
+      </w:pPr>
+    </w:p>
+    <w:p>
+      <w:pPr>
+        <w:rPr>
+          <w:lang w:val="en-US"/>
+        </w:rPr>
+      </w:pPr>
+      <w:r>
+        <w:rPr>
+          <w:lang w:val="en-US"/>
+        </w:rPr>
+        <w:t>The ‘System Overview’ button</w:t>
+      </w:r>
+      <w:r>
+        <w:rPr>
+          <w:lang w:val="en-US"/>
+        </w:rPr>
+        <w:t xml:space="preserve"> </w:t>
+      </w:r>
+      <w:r>
+        <w:rPr>
+          <w:lang w:val="en-US"/>
+        </w:rPr>
+        <w:t xml:space="preserve">displays a </w:t>
+      </w:r>
+      <w:r>
+        <w:rPr>
+          <w:lang w:val="en-US"/>
+        </w:rPr>
+        <w:t>end-to-end data processing system</w:t>
+      </w:r>
+    </w:p>
+    <w:p>
+      <w:pPr>
+        <w:rPr>
+          <w:lang w:val="en-US"/>
+        </w:rPr>
+      </w:pPr>
+    </w:p>
+    <w:p>
+      <w:pPr>
+        <w:rPr>
+          <w:lang w:val="en-US"/>
+        </w:rPr>
+      </w:pPr>
+      <w:r>
+        <w:rPr>
+          <w:lang w:val="en-US"/>
+        </w:rPr>
+        <w:t>      The figure illustrates the end-to-end data processing architecture of the explainability system, mapping out the bi-directional flow between users and heterogeneous storage layers. At the top, users and external systems submit raw queries or requests, which are immediately intercepted by the Provenance Annotator middleware layer. This component transparently rewrites and enriches the queries with algebraic annotations (such as semiring tokens) before passing them to the Distributed Query Engine (Trino). Acting as a unified data gateway, this engine federates execution down across the storage tier—comprising APIs, SQL databases, CSV files, Access databases (MDB), standard DB storage, JSON scripts, and cold Parquet file shares. Data transformations occur natively within these sources, which stream partial records back up to the query engine for final aggregation, allowing the system to deliver unified, fully traceable outcomes back to the user through the provenance middleware.</w:t>
+      </w:r>
+    </w:p>
+    <w:p>
+      <w:pPr>
+        <w:rPr>
+          <w:lang w:val="en-US"/>
+        </w:rPr>
+      </w:pPr>
+    </w:p>
+    <w:p>
+      <w:pPr>
+        <w:rPr>
+          <w:lang w:val="en-US"/>
+        </w:rPr>
+      </w:pPr>
+    </w:p>
+    <w:p>
+      <w:pPr>
+        <w:rPr>
+          <w:lang w:val="en-US"/>
+        </w:rPr>
+      </w:pPr>
+    </w:p>
+    <w:p>
+      <w:pPr>
+        <w:rPr>
+          <w:lang w:val="en-US"/>
+        </w:rPr>
+      </w:pPr>
+    </w:p>
     <w:sectPr>
       <w:pgSz w:w="11906" w:h="16838"/>
       <w:pgMar w:top="720" w:right="720" w:bottom="720" w:left="720" w:header="708" w:footer="708" w:gutter="0"/>

</xml_diff>

<commit_message>
Version 1.0 . submitted
</commit_message>
<xml_diff>
--- a/abstract.docx
+++ b/abstract.docx
@@ -92,21 +92,7 @@
         <w:rPr>
           <w:lang w:val="en-US"/>
         </w:rPr>
-        <w:t xml:space="preserve">In this work, we discuss how data provenance can be leveraged to support end-to-end explainability across data analytics and machine learning (ML) pipelines. We introduce the core concepts of provenance semirings and </w:t>
-      </w:r>
-      <w:proofErr w:type="spellStart"/>
-      <w:r>
-        <w:rPr>
-          <w:lang w:val="en-US"/>
-        </w:rPr>
-        <w:t>semimodules</w:t>
-      </w:r>
-      <w:proofErr w:type="spellEnd"/>
-      <w:r>
-        <w:rPr>
-          <w:lang w:val="en-US"/>
-        </w:rPr>
-        <w:t xml:space="preserve"> to construct fine-grained algebraic annotations over relational operations and aggregate queries. By mapping the contribution of individual input elements into elementary conjunction, disjunction and aggregation metadata, these annotations </w:t>
+        <w:t xml:space="preserve">In this work, we discuss how data provenance can be leveraged to support end-to-end explainability across data analytics and machine learning (ML) pipelines. We introduce the core concepts of provenance semirings and semimodules to construct fine-grained algebraic annotations over relational operations and aggregate queries. By mapping the contribution of individual input elements into elementary conjunction, disjunction and aggregation metadata, these annotations </w:t>
       </w:r>
       <w:r>
         <w:rPr>
@@ -747,49 +733,7 @@
         <w:rPr>
           <w:lang w:val="en-US"/>
         </w:rPr>
-        <w:t xml:space="preserve">incorporate data provenance information, enabling users to trace the lineage of individual data points back to their original sources and </w:t>
-      </w:r>
-      <w:proofErr w:type="spellStart"/>
-      <w:r>
-        <w:rPr>
-          <w:lang w:val="en-US"/>
-        </w:rPr>
-        <w:t>transformations.First</w:t>
-      </w:r>
-      <w:proofErr w:type="spellEnd"/>
-      <w:r>
-        <w:rPr>
-          <w:lang w:val="en-US"/>
-        </w:rPr>
-        <w:t xml:space="preserve">, we present the foundational concepts of provenance semirings and </w:t>
-      </w:r>
-      <w:proofErr w:type="spellStart"/>
-      <w:r>
-        <w:rPr>
-          <w:lang w:val="en-US"/>
-        </w:rPr>
-        <w:t>semimodules</w:t>
-      </w:r>
-      <w:proofErr w:type="spellEnd"/>
-      <w:r>
-        <w:rPr>
-          <w:lang w:val="en-US"/>
-        </w:rPr>
-        <w:t xml:space="preserve"> for modeling and formalizing fine-grained algebraic annotations over relational operations and aggregate </w:t>
-      </w:r>
-      <w:proofErr w:type="spellStart"/>
-      <w:r>
-        <w:rPr>
-          <w:lang w:val="en-US"/>
-        </w:rPr>
-        <w:t>queries.Next</w:t>
-      </w:r>
-      <w:proofErr w:type="spellEnd"/>
-      <w:r>
-        <w:rPr>
-          <w:lang w:val="en-US"/>
-        </w:rPr>
-        <w:t>, we present two comprehensive examples demonstrating how to leverage data provenance to trace data transformation and derivation processes originating from multiple heterogeneous sources. The first case explores a baseline data lineage example to explain how individual output tuples can be mapped backward through relational joins and selections directly to their respective source records.</w:t>
+        <w:t>incorporate data provenance information, enabling users to trace the lineage of individual data points back to their original sources and transformations.First, we present the foundational concepts of provenance semirings and semimodules for modeling and formalizing fine-grained algebraic annotations over relational operations and aggregate queries.Next, we present two comprehensive examples demonstrating how to leverage data provenance to trace data transformation and derivation processes originating from multiple heterogeneous sources. The first case explores a baseline data lineage example to explain how individual output tuples can be mapped backward through relational joins and selections directly to their respective source records.</w:t>
       </w:r>
     </w:p>
     <w:p>
@@ -875,15 +819,7 @@
         <w:t xml:space="preserve">com origem em diversas fontes heterogéneas. </w:t>
       </w:r>
       <w:r>
-        <w:t xml:space="preserve">Primeiro apresentamos um exemplo mais simples, data </w:t>
-      </w:r>
-      <w:proofErr w:type="spellStart"/>
-      <w:r>
-        <w:t>lineage</w:t>
-      </w:r>
-      <w:proofErr w:type="spellEnd"/>
-      <w:r>
-        <w:t xml:space="preserve">, </w:t>
+        <w:t xml:space="preserve">Primeiro apresentamos um exemplo mais simples, data lineage, </w:t>
       </w:r>
       <w:r>
         <w:t>para explicar como …</w:t>
@@ -1007,21 +943,7 @@
           <w:lang w:val="en-US"/>
         </w:rPr>
         <w:lastRenderedPageBreak/>
-        <w:t xml:space="preserve">Taking </w:t>
-      </w:r>
-      <w:proofErr w:type="spellStart"/>
-      <w:r>
-        <w:rPr>
-          <w:lang w:val="en-US"/>
-        </w:rPr>
-        <w:t>DataProv</w:t>
-      </w:r>
-      <w:proofErr w:type="spellEnd"/>
-      <w:r>
-        <w:rPr>
-          <w:lang w:val="en-US"/>
-        </w:rPr>
-        <w:t xml:space="preserve"> as a structural reference, the system </w:t>
+        <w:t xml:space="preserve">Taking DataProv as a structural reference, the system </w:t>
       </w:r>
       <w:r>
         <w:rPr>
@@ -1164,13 +1086,8 @@
         <w:t xml:space="preserve"> consulta pode ser gravado com proveniência</w:t>
       </w:r>
       <w:r>
-        <w:t xml:space="preserve"> numa base de dados ou como uma </w:t>
-      </w:r>
-      <w:proofErr w:type="spellStart"/>
-      <w:r>
-        <w:t>dataset</w:t>
-      </w:r>
-      <w:proofErr w:type="spellEnd"/>
+        <w:t xml:space="preserve"> numa base de dados ou como uma dataset</w:t>
+      </w:r>
       <w:r>
         <w:t xml:space="preserve"> e usado recursivamente.</w:t>
       </w:r>
@@ -1181,231 +1098,168 @@
           <w:lang w:val="en-US"/>
         </w:rPr>
       </w:pPr>
-      <w:proofErr w:type="spellStart"/>
-      <w:r>
-        <w:t>of</w:t>
-      </w:r>
-      <w:proofErr w:type="spellEnd"/>
-      <w:r>
+      <w:r>
+        <w:t xml:space="preserve">of </w:t>
+      </w:r>
+      <w:r>
+        <w:t xml:space="preserve">relational algebra execution plan. </w:t>
+      </w:r>
+      <w:r>
+        <w:rPr>
+          <w:lang w:val="en-US"/>
+        </w:rPr>
+        <w:t>In accordance with the foundational theories of provenance semirings and semi-modules, the engine systematically translates these database operators into mathematical structures, mapping projections and selections to semiring multiplications, union combinations to semiring additions, and aggregate processing workflows to tensor scale modifications. Once these algebraic polynomial variables are injected directly into the corresponding AST expression nodes, the compiler performs an inverse translation rewrite to reconstruct a fully valid, synthesized target SQL statement equipped with active execution provenance instrumentation layers.</w:t>
+      </w:r>
+    </w:p>
+    <w:p>
+      <w:pPr>
+        <w:rPr>
+          <w:lang w:val="en-US"/>
+        </w:rPr>
+      </w:pPr>
+    </w:p>
+    <w:p>
+      <w:pPr>
+        <w:rPr>
+          <w:lang w:val="en-US"/>
+        </w:rPr>
+      </w:pPr>
+    </w:p>
+    <w:p>
+      <w:pPr>
+        <w:rPr>
+          <w:lang w:val="en-US"/>
+        </w:rPr>
+      </w:pPr>
+    </w:p>
+    <w:p>
+      <w:pPr>
+        <w:rPr>
+          <w:lang w:val="en-US"/>
+        </w:rPr>
+      </w:pPr>
+      <w:r>
+        <w:rPr>
+          <w:lang w:val="en-US"/>
+        </w:rPr>
+        <w:t>The ‘System Overview’ button</w:t>
+      </w:r>
+      <w:r>
+        <w:rPr>
+          <w:lang w:val="en-US"/>
+        </w:rPr>
         <w:t xml:space="preserve"> </w:t>
       </w:r>
-      <w:proofErr w:type="spellStart"/>
-      <w:r>
-        <w:t>relational</w:t>
-      </w:r>
-      <w:proofErr w:type="spellEnd"/>
+      <w:r>
+        <w:rPr>
+          <w:lang w:val="en-US"/>
+        </w:rPr>
+        <w:t xml:space="preserve">displays a </w:t>
+      </w:r>
+      <w:r>
+        <w:rPr>
+          <w:lang w:val="en-US"/>
+        </w:rPr>
+        <w:t>end-to-end data processing system</w:t>
+      </w:r>
+    </w:p>
+    <w:p>
+      <w:pPr>
+        <w:rPr>
+          <w:lang w:val="en-US"/>
+        </w:rPr>
+      </w:pPr>
+    </w:p>
+    <w:p>
+      <w:pPr>
+        <w:rPr>
+          <w:lang w:val="en-US"/>
+        </w:rPr>
+      </w:pPr>
+      <w:r>
+        <w:rPr>
+          <w:lang w:val="en-US"/>
+        </w:rPr>
+        <w:t>      The figure illustrates the end-to-end data processing architecture of the explainability system, mapping out the bi-directional flow between users and heterogeneous storage layers. At the top, users and external systems submit raw queries or requests, which are immediately intercepted by the Provenance Annotator middleware layer. This component transparently rewrites and enriches the queries with algebraic annotations (such as semiring tokens) before passing them to the Distributed Query Engine (Trino). Acting as a unified data gateway, this engine federates execution down across the storage tier—comprising APIs, SQL databases, CSV files, Access databases (MDB), standard DB storage, JSON scripts, and cold Parquet file shares. Data transformations occur natively within these sources, which stream partial records back up to the query engine for final aggregation, allowing the system to deliver unified, fully traceable outcomes back to the user through the provenance middleware.</w:t>
+      </w:r>
+    </w:p>
+    <w:p>
+      <w:pPr>
+        <w:rPr>
+          <w:lang w:val="en-US"/>
+        </w:rPr>
+      </w:pPr>
+    </w:p>
+    <w:p>
+      <w:pPr>
+        <w:rPr>
+          <w:lang w:val="en-US"/>
+        </w:rPr>
+      </w:pPr>
+    </w:p>
+    <w:p>
+      <w:r>
+        <w:t xml:space="preserve">Este </w:t>
+      </w:r>
+      <w:r>
+        <w:t>cenário</w:t>
+      </w:r>
+      <w:r>
+        <w:t xml:space="preserve"> foi construído c</w:t>
+      </w:r>
+      <w:r>
+        <w:t xml:space="preserve">om base </w:t>
+      </w:r>
+      <w:r>
+        <w:t xml:space="preserve">na estrutura </w:t>
+      </w:r>
+      <w:r>
+        <w:t>de dados apresentad</w:t>
+      </w:r>
+      <w:r>
+        <w:t>a</w:t>
+      </w:r>
+      <w:r>
+        <w:t xml:space="preserve"> no Exemplo 1</w:t>
+      </w:r>
       <w:r>
         <w:t xml:space="preserve"> </w:t>
       </w:r>
-      <w:proofErr w:type="spellStart"/>
-      <w:r>
-        <w:t>algebra</w:t>
-      </w:r>
-      <w:proofErr w:type="spellEnd"/>
+      <w:r>
+        <w:t xml:space="preserve">mas com datasets mais completos (mais registos). </w:t>
+      </w:r>
+      <w:r>
+        <w:t>Os dados fontes estão representados nas tabelas</w:t>
+      </w:r>
+      <w:r>
+        <w:t xml:space="preserve">nas colunas à </w:t>
+      </w:r>
+      <w:r>
+        <w:t>esquerda. Os resultados d</w:t>
+      </w:r>
+      <w:r>
+        <w:t>erivados da consulta</w:t>
+      </w:r>
+      <w:r>
+        <w:t xml:space="preserve"> estão na coluna À direita.</w:t>
+      </w:r>
       <w:r>
         <w:t xml:space="preserve"> </w:t>
       </w:r>
-      <w:proofErr w:type="spellStart"/>
-      <w:r>
-        <w:t>execution</w:t>
-      </w:r>
-      <w:proofErr w:type="spellEnd"/>
       <w:r>
         <w:t xml:space="preserve"> </w:t>
       </w:r>
-      <w:proofErr w:type="spellStart"/>
-      <w:r>
-        <w:t>plan</w:t>
-      </w:r>
-      <w:proofErr w:type="spellEnd"/>
-      <w:r>
-        <w:t xml:space="preserve">. </w:t>
-      </w:r>
-      <w:r>
-        <w:rPr>
-          <w:lang w:val="en-US"/>
-        </w:rPr>
-        <w:t>In accordance with the foundational theories of provenance semirings and semi-modules, the engine systematically translates these database operators into mathematical structures, mapping projections and selections to semiring multiplications, union combinations to semiring additions, and aggregate processing workflows to tensor scale modifications. Once these algebraic polynomial variables are injected directly into the corresponding AST expression nodes, the compiler performs an inverse translation rewrite to reconstruct a fully valid, synthesized target SQL statement equipped with active execution provenance instrumentation layers.</w:t>
-      </w:r>
-    </w:p>
-    <w:p>
-      <w:pPr>
-        <w:rPr>
-          <w:lang w:val="en-US"/>
-        </w:rPr>
-      </w:pPr>
-    </w:p>
-    <w:p>
-      <w:pPr>
-        <w:rPr>
-          <w:lang w:val="en-US"/>
-        </w:rPr>
-      </w:pPr>
-    </w:p>
-    <w:p>
-      <w:pPr>
-        <w:rPr>
-          <w:lang w:val="en-US"/>
-        </w:rPr>
-      </w:pPr>
-    </w:p>
-    <w:p>
-      <w:pPr>
-        <w:rPr>
-          <w:lang w:val="en-US"/>
-        </w:rPr>
-      </w:pPr>
-      <w:r>
-        <w:rPr>
-          <w:lang w:val="en-US"/>
-        </w:rPr>
-        <w:t>The ‘System Overview’ button</w:t>
-      </w:r>
-      <w:r>
-        <w:rPr>
-          <w:lang w:val="en-US"/>
-        </w:rPr>
-        <w:t xml:space="preserve"> </w:t>
-      </w:r>
-      <w:r>
-        <w:rPr>
-          <w:lang w:val="en-US"/>
-        </w:rPr>
-        <w:t xml:space="preserve">displays a </w:t>
-      </w:r>
-      <w:r>
-        <w:rPr>
-          <w:lang w:val="en-US"/>
-        </w:rPr>
-        <w:t>end-to-end data processing system</w:t>
-      </w:r>
-    </w:p>
-    <w:p>
-      <w:pPr>
-        <w:rPr>
-          <w:lang w:val="en-US"/>
-        </w:rPr>
-      </w:pPr>
-    </w:p>
-    <w:p>
-      <w:pPr>
-        <w:rPr>
-          <w:lang w:val="en-US"/>
-        </w:rPr>
-      </w:pPr>
-      <w:r>
-        <w:rPr>
-          <w:lang w:val="en-US"/>
-        </w:rPr>
-        <w:t>      The figure illustrates the end-to-end data processing architecture of the explainability system, mapping out the bi-directional flow between users and heterogeneous storage layers. At the top, users and external systems submit raw queries or requests, which are immediately intercepted by the Provenance Annotator middleware layer. This component transparently rewrites and enriches the queries with algebraic annotations (such as semiring tokens) before passing them to the Distributed Query Engine (Trino). Acting as a unified data gateway, this engine federates execution down across the storage tier—comprising APIs, SQL databases, CSV files, Access databases (MDB), standard DB storage, JSON scripts, and cold Parquet file shares. Data transformations occur natively within these sources, which stream partial records back up to the query engine for final aggregation, allowing the system to deliver unified, fully traceable outcomes back to the user through the provenance middleware.</w:t>
-      </w:r>
-    </w:p>
-    <w:p>
-      <w:pPr>
-        <w:rPr>
-          <w:lang w:val="en-US"/>
-        </w:rPr>
-      </w:pPr>
-    </w:p>
-    <w:p>
-      <w:pPr>
-        <w:rPr>
-          <w:lang w:val="en-US"/>
-        </w:rPr>
-      </w:pPr>
-    </w:p>
-    <w:p>
-      <w:r>
-        <w:t xml:space="preserve">Este </w:t>
-      </w:r>
-      <w:r>
-        <w:t>cenário</w:t>
-      </w:r>
-      <w:r>
-        <w:t xml:space="preserve"> foi construído c</w:t>
-      </w:r>
-      <w:r>
-        <w:t xml:space="preserve">om base </w:t>
-      </w:r>
-      <w:r>
-        <w:t xml:space="preserve">na estrutura </w:t>
-      </w:r>
-      <w:r>
-        <w:t>de dados apresentad</w:t>
-      </w:r>
-      <w:r>
-        <w:t>a</w:t>
-      </w:r>
-      <w:r>
-        <w:t xml:space="preserve"> no Exemplo 1</w:t>
-      </w:r>
-      <w:r>
-        <w:t xml:space="preserve"> </w:t>
-      </w:r>
-      <w:r>
-        <w:t xml:space="preserve">mas com </w:t>
-      </w:r>
-      <w:proofErr w:type="spellStart"/>
-      <w:r>
-        <w:t>datasets</w:t>
-      </w:r>
-      <w:proofErr w:type="spellEnd"/>
-      <w:r>
-        <w:t xml:space="preserve"> mais completos (mais registos). </w:t>
-      </w:r>
-      <w:r>
-        <w:t xml:space="preserve">Os dados fontes estão representados nas </w:t>
-      </w:r>
-      <w:proofErr w:type="spellStart"/>
-      <w:r>
-        <w:t>tabelas</w:t>
-      </w:r>
-      <w:r>
-        <w:t>nas</w:t>
-      </w:r>
-      <w:proofErr w:type="spellEnd"/>
-      <w:r>
-        <w:t xml:space="preserve"> colunas à </w:t>
-      </w:r>
-      <w:r>
-        <w:t>esquerda. Os resultados d</w:t>
-      </w:r>
-      <w:r>
-        <w:t>erivados da consulta</w:t>
-      </w:r>
-      <w:r>
-        <w:t xml:space="preserve"> estão na coluna À direita.</w:t>
-      </w:r>
-      <w:r>
-        <w:t xml:space="preserve"> </w:t>
-      </w:r>
-      <w:r>
-        <w:t xml:space="preserve"> </w:t>
-      </w:r>
       <w:r>
         <w:t xml:space="preserve">As ligações </w:t>
       </w:r>
       <w:r>
         <w:t xml:space="preserve">um-para-um entre </w:t>
       </w:r>
-      <w:proofErr w:type="spellStart"/>
-      <w:r>
-        <w:t>tuplos</w:t>
-      </w:r>
-      <w:proofErr w:type="spellEnd"/>
-      <w:r>
-        <w:t xml:space="preserve"> </w:t>
-      </w:r>
-      <w:r>
-        <w:t xml:space="preserve">representam conjunções de </w:t>
-      </w:r>
-      <w:proofErr w:type="spellStart"/>
-      <w:r>
-        <w:t>tuplos</w:t>
-      </w:r>
-      <w:proofErr w:type="spellEnd"/>
-      <w:r>
-        <w:t xml:space="preserve"> de conjuntos de dados diferentes, </w:t>
+      <w:r>
+        <w:t xml:space="preserve">tuplos </w:t>
+      </w:r>
+      <w:r>
+        <w:t xml:space="preserve">representam conjunções de tuplos de conjuntos de dados diferentes, </w:t>
       </w:r>
       <w:r>
         <w:t>As ligações um-para-muitos representam disjunções</w:t>
@@ -1428,29 +1282,13 @@
         <w:t xml:space="preserve">analisar visualmente, e de uma forma mais simples do que analisando </w:t>
       </w:r>
       <w:r>
-        <w:t xml:space="preserve">as anotações de proveniência, por exemplo, quais são os </w:t>
-      </w:r>
-      <w:proofErr w:type="spellStart"/>
-      <w:r>
-        <w:t>tuplos</w:t>
-      </w:r>
-      <w:proofErr w:type="spellEnd"/>
-      <w:r>
-        <w:t xml:space="preserve"> que mais </w:t>
+        <w:t xml:space="preserve">as anotações de proveniência, por exemplo, quais são os tuplos que mais </w:t>
       </w:r>
       <w:r>
         <w:t xml:space="preserve">e menos contribuíram para a formação dos resultados. </w:t>
       </w:r>
       <w:r>
-        <w:t xml:space="preserve">Selecionado um </w:t>
-      </w:r>
-      <w:proofErr w:type="spellStart"/>
-      <w:r>
-        <w:t>tuplo</w:t>
-      </w:r>
-      <w:proofErr w:type="spellEnd"/>
-      <w:r>
-        <w:t xml:space="preserve"> do output </w:t>
+        <w:t xml:space="preserve">Selecionado um tuplo do output </w:t>
       </w:r>
       <w:r>
         <w:t xml:space="preserve">podemos ver quais os dados de input que </w:t>
@@ -1465,26 +1303,10 @@
         <w:t xml:space="preserve">e resultado. Similarmente, selecionando </w:t>
       </w:r>
       <w:r>
-        <w:t xml:space="preserve">um </w:t>
-      </w:r>
-      <w:proofErr w:type="spellStart"/>
-      <w:r>
-        <w:t>tuplo</w:t>
-      </w:r>
-      <w:proofErr w:type="spellEnd"/>
-      <w:r>
-        <w:t xml:space="preserve"> das tabelas à esquerda é possível visualizar quais </w:t>
-      </w:r>
-      <w:r>
-        <w:t xml:space="preserve">os resultados que dependem de um </w:t>
-      </w:r>
-      <w:proofErr w:type="spellStart"/>
-      <w:r>
-        <w:t>tuplo</w:t>
-      </w:r>
-      <w:proofErr w:type="spellEnd"/>
-      <w:r>
-        <w:t xml:space="preserve"> dos dados de origem. </w:t>
+        <w:t xml:space="preserve">um tuplo das tabelas à esquerda é possível visualizar quais </w:t>
+      </w:r>
+      <w:r>
+        <w:t xml:space="preserve">os resultados que dependem de um tuplo dos dados de origem. </w:t>
       </w:r>
     </w:p>
     <w:p>
@@ -1832,15 +1654,7 @@
         <w:t xml:space="preserve"> e casos de favorecimento ou desfavorecimento de grupos de empregados </w:t>
       </w:r>
       <w:r>
-        <w:t xml:space="preserve">por género, departamento, superiores hierárquicos ou sector de </w:t>
-      </w:r>
-      <w:proofErr w:type="spellStart"/>
-      <w:r>
-        <w:t>actividade</w:t>
-      </w:r>
-      <w:proofErr w:type="spellEnd"/>
-      <w:r>
-        <w:t>.</w:t>
+        <w:t>por género, departamento, superiores hierárquicos ou sector de actividade.</w:t>
       </w:r>
     </w:p>
     <w:p/>
@@ -1922,89 +1736,513 @@
           <w:lang w:val="en-US"/>
         </w:rPr>
       </w:pPr>
-    </w:p>
-    <w:p>
-      <w:pPr>
-        <w:rPr>
-          <w:lang w:val="en-US"/>
-        </w:rPr>
-      </w:pPr>
-      <w:r>
-        <w:rPr>
-          <w:lang w:val="en-US"/>
-        </w:rPr>
-        <w:t>select *</w:t>
-      </w:r>
-    </w:p>
-    <w:p>
-      <w:pPr>
-        <w:rPr>
-          <w:lang w:val="en-US"/>
-        </w:rPr>
-      </w:pPr>
-      <w:r>
-        <w:rPr>
-          <w:lang w:val="en-US"/>
-        </w:rPr>
-        <w:t xml:space="preserve">from </w:t>
-      </w:r>
-      <w:proofErr w:type="spellStart"/>
-      <w:r>
-        <w:rPr>
-          <w:lang w:val="en-US"/>
-        </w:rPr>
-        <w:t>employees_old.parquet</w:t>
-      </w:r>
-      <w:proofErr w:type="spellEnd"/>
-      <w:r>
-        <w:rPr>
-          <w:lang w:val="en-US"/>
-        </w:rPr>
-        <w:t xml:space="preserve"> E INNER JOIN </w:t>
-      </w:r>
-      <w:proofErr w:type="spellStart"/>
-      <w:r>
-        <w:rPr>
-          <w:lang w:val="en-US"/>
-        </w:rPr>
-        <w:t>promotions.parquet</w:t>
-      </w:r>
-      <w:proofErr w:type="spellEnd"/>
-      <w:r>
-        <w:rPr>
-          <w:lang w:val="en-US"/>
-        </w:rPr>
-        <w:t xml:space="preserve"> P on </w:t>
-      </w:r>
-      <w:proofErr w:type="spellStart"/>
-      <w:r>
-        <w:rPr>
-          <w:lang w:val="en-US"/>
-        </w:rPr>
-        <w:t>E.empId</w:t>
-      </w:r>
-      <w:proofErr w:type="spellEnd"/>
-      <w:r>
-        <w:rPr>
-          <w:lang w:val="en-US"/>
-        </w:rPr>
-        <w:t xml:space="preserve"> = </w:t>
-      </w:r>
-      <w:proofErr w:type="spellStart"/>
-      <w:r>
-        <w:rPr>
-          <w:lang w:val="en-US"/>
-        </w:rPr>
-        <w:t>P.empId</w:t>
-      </w:r>
-      <w:proofErr w:type="spellEnd"/>
-    </w:p>
-    <w:p>
-      <w:pPr>
-        <w:rPr>
-          <w:lang w:val="en-US"/>
-        </w:rPr>
-      </w:pPr>
+      <w:r>
+        <w:rPr>
+          <w:b/>
+          <w:bCs/>
+          <w:lang w:val="en-US"/>
+        </w:rPr>
+        <w:t>select count(*)</w:t>
+      </w:r>
+    </w:p>
+    <w:p>
+      <w:pPr>
+        <w:rPr>
+          <w:b/>
+          <w:bCs/>
+          <w:lang w:val="en-US"/>
+        </w:rPr>
+      </w:pPr>
+      <w:r>
+        <w:rPr>
+          <w:b/>
+          <w:bCs/>
+          <w:lang w:val="en-US"/>
+        </w:rPr>
+        <w:t>from employees_old.parquet E INNER JOIN promotions.parquet P on E.empId = P.empId</w:t>
+      </w:r>
+    </w:p>
+    <w:p>
+      <w:pPr>
+        <w:rPr>
+          <w:b/>
+          <w:bCs/>
+          <w:lang w:val="en-US"/>
+        </w:rPr>
+      </w:pPr>
+      <w:r>
+        <w:rPr>
+          <w:b/>
+          <w:bCs/>
+          <w:lang w:val="en-US"/>
+        </w:rPr>
+        <w:t xml:space="preserve">     INNER JOIN annual_reviews.parquet A on E.empId = A.empId</w:t>
+      </w:r>
+    </w:p>
+    <w:p>
+      <w:pPr>
+        <w:rPr>
+          <w:b/>
+          <w:bCs/>
+          <w:lang w:val="en-US"/>
+        </w:rPr>
+      </w:pPr>
+      <w:r>
+        <w:rPr>
+          <w:b/>
+          <w:bCs/>
+          <w:lang w:val="en-US"/>
+        </w:rPr>
+        <w:t xml:space="preserve">     INNER JOIN business_reviews.parquet B ON CAST(E.empId AS VARCHAR) = CAST(B.empId AS VARCHAR)</w:t>
+      </w:r>
+    </w:p>
+    <w:p>
+      <w:pPr>
+        <w:rPr>
+          <w:b/>
+          <w:bCs/>
+          <w:lang w:val="en-US"/>
+        </w:rPr>
+      </w:pPr>
+      <w:r>
+        <w:rPr>
+          <w:b/>
+          <w:bCs/>
+          <w:lang w:val="en-US"/>
+        </w:rPr>
+        <w:t xml:space="preserve">     INNER JOIN manager_reviews.parquet M ON CAST(E.empId AS VARCHAR) = CAST(M.empId AS VARCHAR)</w:t>
+      </w:r>
+    </w:p>
+    <w:p>
+      <w:pPr>
+        <w:rPr>
+          <w:b/>
+          <w:bCs/>
+          <w:lang w:val="en-US"/>
+        </w:rPr>
+      </w:pPr>
+    </w:p>
+    <w:p>
+      <w:pPr>
+        <w:rPr>
+          <w:b/>
+          <w:bCs/>
+          <w:lang w:val="en-US"/>
+        </w:rPr>
+      </w:pPr>
+    </w:p>
+    <w:p>
+      <w:pPr>
+        <w:rPr>
+          <w:b/>
+          <w:bCs/>
+          <w:lang w:val="en-US"/>
+        </w:rPr>
+      </w:pPr>
+    </w:p>
+    <w:p>
+      <w:r>
+        <w:t xml:space="preserve">A análise dos dados mostrou que </w:t>
+      </w:r>
+      <w:r>
+        <w:t xml:space="preserve">em toda a empresa, 83% dos </w:t>
+      </w:r>
+      <w:r>
+        <w:t xml:space="preserve">candidatos a uma promoção foram promovidos e </w:t>
+      </w:r>
+      <w:r>
+        <w:t>17% não</w:t>
+      </w:r>
+      <w:r>
+        <w:t xml:space="preserve"> o</w:t>
+      </w:r>
+      <w:r>
+        <w:t xml:space="preserve"> foram.</w:t>
+      </w:r>
+    </w:p>
+    <w:p>
+      <w:pPr>
+        <w:rPr>
+          <w:b/>
+          <w:bCs/>
+        </w:rPr>
+      </w:pPr>
+      <w:r>
+        <w:rPr>
+          <w:b/>
+          <w:bCs/>
+        </w:rPr>
+        <w:t>A</w:t>
+      </w:r>
+      <w:r>
+        <w:rPr>
+          <w:b/>
+          <w:bCs/>
+        </w:rPr>
+        <w:t>nalisado os dados</w:t>
+      </w:r>
+      <w:r>
+        <w:rPr>
+          <w:b/>
+          <w:bCs/>
+        </w:rPr>
+        <w:t xml:space="preserve"> e</w:t>
+      </w:r>
+      <w:r>
+        <w:rPr>
+          <w:b/>
+          <w:bCs/>
+        </w:rPr>
+        <w:t xml:space="preserve"> </w:t>
+      </w:r>
+      <w:r>
+        <w:rPr>
+          <w:b/>
+          <w:bCs/>
+        </w:rPr>
+        <w:t xml:space="preserve">fazendo a traçagem dos dados </w:t>
+      </w:r>
+      <w:r>
+        <w:rPr>
+          <w:b/>
+          <w:bCs/>
+        </w:rPr>
+        <w:t>das relacionando as promoções com os dados fonte, verifica</w:t>
+      </w:r>
+      <w:r>
+        <w:rPr>
+          <w:b/>
+          <w:bCs/>
+        </w:rPr>
+        <w:t>-se</w:t>
+      </w:r>
+      <w:r>
+        <w:rPr>
+          <w:b/>
+          <w:bCs/>
+        </w:rPr>
+        <w:t xml:space="preserve"> </w:t>
+      </w:r>
+      <w:r>
+        <w:rPr>
+          <w:b/>
+          <w:bCs/>
+        </w:rPr>
+        <w:t xml:space="preserve">que os caminhos </w:t>
+      </w:r>
+      <w:r>
+        <w:rPr>
+          <w:b/>
+          <w:bCs/>
+        </w:rPr>
+        <w:t xml:space="preserve">de derivação </w:t>
+      </w:r>
+      <w:r>
+        <w:rPr>
+          <w:b/>
+          <w:bCs/>
+        </w:rPr>
+        <w:t xml:space="preserve">que </w:t>
+      </w:r>
+      <w:r>
+        <w:rPr>
+          <w:b/>
+          <w:bCs/>
+        </w:rPr>
+        <w:t xml:space="preserve">cruzam a </w:t>
+      </w:r>
+      <w:r>
+        <w:rPr>
+          <w:b/>
+          <w:bCs/>
+        </w:rPr>
+        <w:t>tabela Annual</w:t>
+      </w:r>
+      <w:r>
+        <w:rPr>
+          <w:b/>
+          <w:bCs/>
+        </w:rPr>
+        <w:t>_r</w:t>
+      </w:r>
+      <w:r>
+        <w:rPr>
+          <w:b/>
+          <w:bCs/>
+        </w:rPr>
+        <w:t>eviews</w:t>
+      </w:r>
+      <w:r>
+        <w:rPr>
+          <w:b/>
+          <w:bCs/>
+        </w:rPr>
+        <w:t xml:space="preserve"> e correspondem a </w:t>
+      </w:r>
+      <w:r>
+        <w:rPr>
+          <w:b/>
+          <w:bCs/>
+        </w:rPr>
+        <w:t xml:space="preserve">não </w:t>
+      </w:r>
+      <w:r>
+        <w:rPr>
+          <w:b/>
+          <w:bCs/>
+        </w:rPr>
+        <w:t xml:space="preserve">promoções são </w:t>
+      </w:r>
+      <w:r>
+        <w:rPr>
+          <w:b/>
+          <w:bCs/>
+        </w:rPr>
+        <w:t>em maior número do que os que passam pe</w:t>
+      </w:r>
+      <w:r>
+        <w:rPr>
+          <w:b/>
+          <w:bCs/>
+        </w:rPr>
+        <w:t xml:space="preserve">la junçÕ DAS TABELAS </w:t>
+      </w:r>
+      <w:r>
+        <w:rPr>
+          <w:b/>
+          <w:bCs/>
+        </w:rPr>
+        <w:t>B</w:t>
+      </w:r>
+      <w:r>
+        <w:rPr>
+          <w:b/>
+          <w:bCs/>
+        </w:rPr>
+        <w:t>usiness_revie</w:t>
+      </w:r>
+      <w:r>
+        <w:rPr>
+          <w:b/>
+          <w:bCs/>
+        </w:rPr>
+        <w:t>ws e Manager_reviews.</w:t>
+      </w:r>
+    </w:p>
+    <w:p>
+      <w:pPr>
+        <w:rPr>
+          <w:b/>
+          <w:bCs/>
+        </w:rPr>
+      </w:pPr>
+      <w:r>
+        <w:rPr>
+          <w:b/>
+          <w:bCs/>
+        </w:rPr>
+        <w:t xml:space="preserve">Partindo deste insight, uma nálise detalhada dos dados revelou </w:t>
+      </w:r>
+      <w:r>
+        <w:rPr>
+          <w:b/>
+          <w:bCs/>
+        </w:rPr>
+        <w:t>29% d</w:t>
+      </w:r>
+      <w:r>
+        <w:rPr>
+          <w:b/>
+          <w:bCs/>
+        </w:rPr>
+        <w:t xml:space="preserve">os casos que cruzam as Annual_reviews não foram promovidos enquanto nos outros casos foi apenas 9%. </w:t>
+      </w:r>
+      <w:r>
+        <w:rPr>
+          <w:b/>
+          <w:bCs/>
+        </w:rPr>
+        <w:t xml:space="preserve"> </w:t>
+      </w:r>
+    </w:p>
+    <w:p>
+      <w:pPr>
+        <w:rPr>
+          <w:b/>
+          <w:bCs/>
+        </w:rPr>
+      </w:pPr>
+      <w:r>
+        <w:rPr>
+          <w:b/>
+          <w:bCs/>
+        </w:rPr>
+        <w:t>A médias das três pontuações na gama 0…100, Manager_reviews.score, Business_reviews.score and Anual_reviews.officialScore fica no intervalo 70..71/100.</w:t>
+      </w:r>
+      <w:r>
+        <w:rPr>
+          <w:b/>
+          <w:bCs/>
+        </w:rPr>
+        <w:t xml:space="preserve"> </w:t>
+      </w:r>
+      <w:r>
+        <w:rPr>
+          <w:b/>
+          <w:bCs/>
+        </w:rPr>
+        <w:t xml:space="preserve">O problema estava no conversão </w:t>
+      </w:r>
+      <w:r>
+        <w:rPr>
+          <w:b/>
+          <w:bCs/>
+        </w:rPr>
+        <w:t>dos managerScores de letras</w:t>
+      </w:r>
+      <w:r>
+        <w:rPr>
+          <w:b/>
+          <w:bCs/>
+        </w:rPr>
+        <w:t xml:space="preserve"> A… E</w:t>
+      </w:r>
+      <w:r>
+        <w:rPr>
+          <w:b/>
+          <w:bCs/>
+        </w:rPr>
+        <w:t xml:space="preserve"> para </w:t>
+      </w:r>
+      <w:r>
+        <w:rPr>
+          <w:b/>
+          <w:bCs/>
+        </w:rPr>
+        <w:t>a escala 0...100</w:t>
+      </w:r>
+      <w:r>
+        <w:rPr>
+          <w:b/>
+          <w:bCs/>
+        </w:rPr>
+        <w:t>. A média resultante foi 63/100.</w:t>
+      </w:r>
+      <w:r>
+        <w:rPr>
+          <w:b/>
+          <w:bCs/>
+        </w:rPr>
+        <w:t xml:space="preserve"> </w:t>
+      </w:r>
+    </w:p>
+    <w:p>
+      <w:pPr>
+        <w:rPr>
+          <w:b/>
+          <w:bCs/>
+        </w:rPr>
+      </w:pPr>
+    </w:p>
+    <w:p>
+      <w:pPr>
+        <w:rPr>
+          <w:b/>
+          <w:bCs/>
+        </w:rPr>
+      </w:pPr>
+    </w:p>
+    <w:p>
+      <w:pPr>
+        <w:rPr>
+          <w:lang w:val="en-US"/>
+        </w:rPr>
+      </w:pPr>
+      <w:r>
+        <w:rPr>
+          <w:b/>
+          <w:bCs/>
+          <w:lang w:val="en-US"/>
+        </w:rPr>
+        <w:t xml:space="preserve">The company … that </w:t>
+      </w:r>
+      <w:r>
+        <w:rPr>
+          <w:b/>
+          <w:bCs/>
+          <w:lang w:val="en-US"/>
+        </w:rPr>
+        <w:t xml:space="preserve">83% of </w:t>
+      </w:r>
+      <w:r>
+        <w:rPr>
+          <w:b/>
+          <w:bCs/>
+          <w:lang w:val="en-US"/>
+        </w:rPr>
+        <w:t xml:space="preserve">the </w:t>
+      </w:r>
+      <w:r>
+        <w:rPr>
+          <w:b/>
+          <w:bCs/>
+          <w:lang w:val="en-US"/>
+        </w:rPr>
+        <w:t>candidates were promoted, while 17% were not.</w:t>
+      </w:r>
+    </w:p>
+    <w:p>
+      <w:pPr>
+        <w:rPr>
+          <w:lang w:val="en-US"/>
+        </w:rPr>
+      </w:pPr>
+      <w:r>
+        <w:rPr>
+          <w:b/>
+          <w:bCs/>
+          <w:lang w:val="en-US"/>
+        </w:rPr>
+        <w:t>By tracing the derivation paths linking promotions back to the source data, we observe that derivation paths passing through the Annual_reviews table and corresponding to non-promotions are more numerous than those passing through the join of the Business_reviews and Manager_reviews tables.</w:t>
+      </w:r>
+    </w:p>
+    <w:p>
+      <w:pPr>
+        <w:rPr>
+          <w:lang w:val="en-US"/>
+        </w:rPr>
+      </w:pPr>
+      <w:r>
+        <w:rPr>
+          <w:b/>
+          <w:bCs/>
+          <w:lang w:val="en-US"/>
+        </w:rPr>
+        <w:t>Building on this insight, a more detailed analysis revealed that 29% of the cases passing through Annual_reviews were not promoted, compared to only 9% in the remaining cases.</w:t>
+      </w:r>
+    </w:p>
+    <w:p>
+      <w:pPr>
+        <w:rPr>
+          <w:lang w:val="en-US"/>
+        </w:rPr>
+      </w:pPr>
+      <w:r>
+        <w:rPr>
+          <w:b/>
+          <w:bCs/>
+          <w:lang w:val="en-US"/>
+        </w:rPr>
+        <w:t xml:space="preserve">The average of the three scores — Manager_reviews.score, Business_reviews.score, and Annual_reviews.officialScore — all on a 0–100 scale, falls within the range of 70–71/100. </w:t>
+      </w:r>
+      <w:r>
+        <w:rPr>
+          <w:b/>
+          <w:bCs/>
+          <w:lang w:val="en-US"/>
+        </w:rPr>
+        <w:t>The issue was traced to the conversion of managerScores from letter grades (A–E) to the 0–100 scale, which resulted in a lower average of 63/100.</w:t>
+      </w:r>
     </w:p>
     <w:p>
       <w:pPr>

</xml_diff>